<commit_message>
Document research questions and ablations with verified architecture plates
</commit_message>
<xml_diff>
--- a/docs/docx/GITHUB_RELEASE.docx
+++ b/docs/docx/GITHUB_RELEASE.docx
@@ -30,13 +30,24 @@
           <w:rPr>
             <w:color w:val="176B87"/>
           </w:rPr>
+          <w:t>v1.2.0 architecture and research release</w:t>
+        </w:r>
+      </w:hyperlink>
+      <w:r>
+        <w:t xml:space="preserve"> adds explicit novelty/contribution positioning, research questions, complete README ablation/evaluation tables, original architecture plates and a methods guide. The manuscript incorporates the same architecture and component findings. The </w:t>
+      </w:r>
+      <w:hyperlink r:id="rId13">
+        <w:r>
+          <w:rPr>
+            <w:color w:val="176B87"/>
+          </w:rPr>
           <w:t>v1.1.0 writing release</w:t>
         </w:r>
       </w:hyperlink>
       <w:r>
-        <w:t xml:space="preserve"> adds 20 verified Kaggle visualizations, a supporting CPU notebook and its executed gallery, a manuscript draft, eight editable table sets, bibliography and writing guide. The original </w:t>
+        <w:t xml:space="preserve">, with its 20 verified Kaggle visualizations and executed gallery, and the original </w:t>
       </w:r>
-      <w:hyperlink r:id="rId13">
+      <w:hyperlink r:id="rId14">
         <w:r>
           <w:rPr>
             <w:color w:val="176B87"/>
@@ -45,14 +56,14 @@
         </w:r>
       </w:hyperlink>
       <w:r>
-        <w:t xml:space="preserve"> is preserved. Each release identifies its tagged source and downloadable asset checksums. Repository access requires the owner's GitHub account or an explicit collaborator invitation.</w:t>
+        <w:t xml:space="preserve"> are preserved. Each release identifies its tagged source and downloadable asset checksums. Repository access requires the owner's GitHub account or an explicit collaborator invitation.</w:t>
       </w:r>
     </w:p>
     <w:p>
       <w:r>
         <w:t xml:space="preserve">Start with the root README, </w:t>
       </w:r>
-      <w:hyperlink r:id="rId14">
+      <w:hyperlink r:id="rId15">
         <w:r>
           <w:rPr>
             <w:color w:val="176B87"/>
@@ -63,7 +74,7 @@
       <w:r>
         <w:t xml:space="preserve">, </w:t>
       </w:r>
-      <w:hyperlink r:id="rId15">
+      <w:hyperlink r:id="rId16">
         <w:r>
           <w:rPr>
             <w:color w:val="176B87"/>
@@ -74,7 +85,7 @@
       <w:r>
         <w:t xml:space="preserve"> and </w:t>
       </w:r>
-      <w:hyperlink r:id="rId16">
+      <w:hyperlink r:id="rId17">
         <w:r>
           <w:rPr>
             <w:color w:val="176B87"/>
@@ -287,7 +298,51 @@
               <w:rPr>
                 <w:sz w:val="17"/>
               </w:rPr>
-              <w:t>Dataset card, notebook audit, operation guide, results and PDF copies</w:t>
+              <w:t>Dataset card, notebook audit, operation guide, results, architecture methods and PDF copies</w:t>
+            </w:r>
+          </w:p>
+        </w:tc>
+      </w:tr>
+      <w:tr>
+        <w:trPr>
+          <w:cantSplit/>
+        </w:trPr>
+        <w:tc>
+          <w:tcPr>
+            <w:tcW w:type="dxa" w:w="5018"/>
+          </w:tcPr>
+          <w:p>
+            <w:pPr>
+              <w:keepNext w:val="0"/>
+              <w:keepLines/>
+              <w:spacing w:after="80"/>
+            </w:pPr>
+            <w:r>
+              <w:rPr>
+                <w:rFonts w:ascii="Liberation Mono" w:hAnsi="Liberation Mono"/>
+                <w:b w:val="0"/>
+                <w:i w:val="0"/>
+                <w:sz w:val="17"/>
+              </w:rPr>
+              <w:t>docs/figures/</w:t>
+            </w:r>
+          </w:p>
+        </w:tc>
+        <w:tc>
+          <w:tcPr>
+            <w:tcW w:type="dxa" w:w="5018"/>
+          </w:tcPr>
+          <w:p>
+            <w:pPr>
+              <w:keepNext w:val="0"/>
+              <w:keepLines/>
+              <w:spacing w:after="80"/>
+            </w:pPr>
+            <w:r>
+              <w:rPr>
+                <w:sz w:val="17"/>
+              </w:rPr>
+              <w:t>Original architecture plates, editable vector exports and source/shape manifest</w:t>
             </w:r>
           </w:p>
         </w:tc>
@@ -860,7 +915,7 @@
         <w:br/>
         <w:t>cd mri-conference-research</w:t>
         <w:br/>
-        <w:t>git checkout v1.1.0</w:t>
+        <w:t>git checkout v1.2.0</w:t>
       </w:r>
     </w:p>
     <w:p>
@@ -1004,6 +1059,35 @@
       </w:r>
       <w:r>
         <w:t xml:space="preserve"> with an embedded file inventory and scans for Kaggle and GitHub credential patterns. Keep the downloadable archive as a release asset rather than duplicating it in Git history. GitHub releases also provide source archives for the tagged commit.</w:t>
+      </w:r>
+    </w:p>
+    <w:p>
+      <w:r>
+        <w:t xml:space="preserve">The v1.2.0 architecture update performs a synthetic CPU shape trace and document generation, without new MRI training or inference. Its source/configuration checks and export hashes are in </w:t>
+      </w:r>
+      <w:r>
+        <w:rPr>
+          <w:rFonts w:ascii="Liberation Mono" w:hAnsi="Liberation Mono"/>
+          <w:b w:val="0"/>
+          <w:i w:val="0"/>
+          <w:sz w:val="16"/>
+        </w:rPr>
+        <w:t>docs/figures/architecture_manifest.json</w:t>
+      </w:r>
+      <w:r>
+        <w:t xml:space="preserve">; the update record is </w:t>
+      </w:r>
+      <w:r>
+        <w:rPr>
+          <w:rFonts w:ascii="Liberation Mono" w:hAnsi="Liberation Mono"/>
+          <w:b w:val="0"/>
+          <w:i w:val="0"/>
+          <w:sz w:val="16"/>
+        </w:rPr>
+        <w:t>audit/architecture_publication_record.json</w:t>
+      </w:r>
+      <w:r>
+        <w:t>. Dated v1.0/v1.1 documentation receipts describe those historical releases, not the hashes of subsequently revised writing files. Frozen experimental records and all 20 Kaggle figure bytes retain their original identities.</w:t>
       </w:r>
     </w:p>
     <w:p>

</xml_diff>

<commit_message>
Reflect current public GitHub access in the writing package
</commit_message>
<xml_diff>
--- a/docs/docx/GITHUB_RELEASE.docx
+++ b/docs/docx/GITHUB_RELEASE.docx
@@ -23,7 +23,7 @@
         </w:r>
       </w:hyperlink>
       <w:r>
-        <w:t xml:space="preserve">, with private visibility. The </w:t>
+        <w:t xml:space="preserve">, with public visibility. The </w:t>
       </w:r>
       <w:hyperlink r:id="rId12">
         <w:r>
@@ -56,7 +56,7 @@
         </w:r>
       </w:hyperlink>
       <w:r>
-        <w:t xml:space="preserve"> are preserved. Each release identifies its tagged source and downloadable asset checksums. Repository access requires the owner's GitHub account or an explicit collaborator invitation.</w:t>
+        <w:t xml:space="preserve"> are preserved. Each release identifies its tagged source and downloadable asset checksums. Public source and release downloads do not require collaborator access; pushing changes requires an authorized GitHub account.</w:t>
       </w:r>
     </w:p>
     <w:p>
@@ -897,7 +897,7 @@
     </w:p>
     <w:p>
       <w:r>
-        <w:t>With Git and the GitHub CLI installed, authenticate using your own account and clone the private repository:</w:t>
+        <w:t>Clone the public repository with Git:</w:t>
       </w:r>
     </w:p>
     <w:p>
@@ -909,9 +909,7 @@
           <w:rFonts w:ascii="Liberation Mono" w:hAnsi="Liberation Mono"/>
           <w:sz w:val="15"/>
         </w:rPr>
-        <w:t>gh auth login</w:t>
-        <w:br/>
-        <w:t>gh repo clone Hisernberg/mri-conference-research</w:t>
+        <w:t>git clone https://github.com/Hisernberg/mri-conference-research.git</w:t>
         <w:br/>
         <w:t>cd mri-conference-research</w:t>
         <w:br/>
@@ -996,7 +994,7 @@
     </w:p>
     <w:p>
       <w:r>
-        <w:t>Preserve the released tag and its exact experiment snapshots. Prepare later changes on a branch, inspect the staged contents and push that branch to the same private repository. Publishing a later result requires its own completed evidence and updated release notes.</w:t>
+        <w:t>Preserve the released tag and its exact experiment snapshots. Prepare later changes on a branch, inspect the staged contents and push that branch to the same GitHub repository. Publishing a later result requires its own completed evidence and updated release notes.</w:t>
       </w:r>
     </w:p>
     <w:p>
@@ -1141,6 +1139,11 @@
     <w:p>
       <w:r>
         <w:t>The experiment completion record and original publication receipt describe their dated snapshots. The new visualization verification and Git history identify the subsequent writing extension. Documentation may evolve without rewriting the frozen scientific source, metrics, protocols or v1.0.0 tag.</w:t>
+      </w:r>
+    </w:p>
+    <w:p>
+      <w:r>
+        <w:t>GitHub reported public visibility during the v1.2.0 publication check. This update preserves that current setting; it does not change repository visibility. Earlier private-visibility receipts describe the setting when those records were created. Kaggle run and dataset access remains separate and private.</w:t>
       </w:r>
     </w:p>
     <w:sectPr>

</xml_diff>